<commit_message>
Clean redundant entry points and JDBC bundle
</commit_message>
<xml_diff>
--- a/Báo_cáo_đồ_án_nhóm_5-LOP30.docx
+++ b/Báo_cáo_đồ_án_nhóm_5-LOP30.docx
@@ -3993,25 +3993,23 @@
           <w:szCs w:val="30"/>
           <w:lang w:val="en-US"/>
         </w:rPr>
-        <w:t xml:space="preserve">2. Tác </w:t>
-      </w:r>
-      <w:proofErr w:type="gramStart"/>
+        <w:t>2. Tác Nhân</w:t>
+      </w:r>
       <w:r>
         <w:rPr>
           <w:sz w:val="30"/>
           <w:szCs w:val="30"/>
           <w:lang w:val="en-US"/>
         </w:rPr>
-        <w:t>Nhân(</w:t>
-      </w:r>
-      <w:proofErr w:type="gramEnd"/>
+        <w:t xml:space="preserve"> </w:t>
+      </w:r>
       <w:r>
         <w:rPr>
           <w:sz w:val="30"/>
           <w:szCs w:val="30"/>
           <w:lang w:val="en-US"/>
         </w:rPr>
-        <w:t>Actor)</w:t>
+        <w:t>(Actor)</w:t>
       </w:r>
       <w:bookmarkEnd w:id="13"/>
     </w:p>
@@ -8239,6 +8237,9 @@
               <w:pStyle w:val="NormalWeb"/>
             </w:pPr>
             <w:r>
+              <w:rPr>
+                <w:noProof/>
+              </w:rPr>
               <w:drawing>
                 <wp:inline distT="0" distB="0" distL="0" distR="0" wp14:anchorId="3AA82EF9" wp14:editId="5F8B5FAB">
                   <wp:extent cx="1143000" cy="2819059"/>
@@ -8286,6 +8287,9 @@
               <w:pStyle w:val="NormalWeb"/>
             </w:pPr>
             <w:r>
+              <w:rPr>
+                <w:noProof/>
+              </w:rPr>
               <w:drawing>
                 <wp:inline distT="0" distB="0" distL="0" distR="0" wp14:anchorId="493A0C9E" wp14:editId="5169BF8E">
                   <wp:extent cx="4787265" cy="2781300"/>
@@ -8543,6 +8547,7 @@
           <w:rFonts w:cs="Times New Roman"/>
           <w:b/>
           <w:iCs w:val="0"/>
+          <w:noProof/>
           <w:kern w:val="0"/>
           <w:sz w:val="24"/>
           <w:szCs w:val="24"/>
@@ -8957,6 +8962,9 @@
         <w:pStyle w:val="NormalWeb"/>
       </w:pPr>
       <w:r>
+        <w:rPr>
+          <w:noProof/>
+        </w:rPr>
         <w:drawing>
           <wp:inline distT="0" distB="0" distL="0" distR="0" wp14:anchorId="4B3E5776" wp14:editId="21DA9CD0">
             <wp:extent cx="5969542" cy="4593771"/>
@@ -9021,6 +9029,9 @@
               <w:outlineLvl w:val="2"/>
             </w:pPr>
             <w:r>
+              <w:rPr>
+                <w:noProof/>
+              </w:rPr>
               <w:lastRenderedPageBreak/>
               <w:drawing>
                 <wp:inline distT="0" distB="0" distL="0" distR="0" wp14:anchorId="6E6587CA" wp14:editId="4C162E00">
@@ -9089,6 +9100,9 @@
               <w:outlineLvl w:val="2"/>
             </w:pPr>
             <w:r>
+              <w:rPr>
+                <w:noProof/>
+              </w:rPr>
               <w:drawing>
                 <wp:inline distT="0" distB="0" distL="0" distR="0" wp14:anchorId="42E14847" wp14:editId="38767A24">
                   <wp:extent cx="2835695" cy="1800225"/>
@@ -9299,33 +9313,126 @@
         <w:t xml:space="preserve"> hiển thị nội dung hóa đơn vừa tạo.</w:t>
       </w:r>
     </w:p>
+    <w:tbl>
+      <w:tblPr>
+        <w:tblStyle w:val="TableGrid"/>
+        <w:tblW w:w="0" w:type="auto"/>
+        <w:tblLook w:val="04A0" w:firstRow="1" w:lastRow="0" w:firstColumn="1" w:lastColumn="0" w:noHBand="0" w:noVBand="1"/>
+      </w:tblPr>
+      <w:tblGrid>
+        <w:gridCol w:w="4659"/>
+        <w:gridCol w:w="4686"/>
+      </w:tblGrid>
+      <w:tr>
+        <w:tc>
+          <w:tcPr>
+            <w:tcW w:w="4672" w:type="dxa"/>
+          </w:tcPr>
+          <w:p>
+            <w:pPr>
+              <w:pStyle w:val="NormalWeb"/>
+            </w:pPr>
+            <w:r>
+              <w:drawing>
+                <wp:inline distT="0" distB="0" distL="0" distR="0" wp14:anchorId="09666E85" wp14:editId="46F2ACF7">
+                  <wp:extent cx="3038790" cy="1983740"/>
+                  <wp:effectExtent l="0" t="0" r="9525" b="0"/>
+                  <wp:docPr id="4" name="Picture 4"/>
+                  <wp:cNvGraphicFramePr>
+                    <a:graphicFrameLocks xmlns:a="http://schemas.openxmlformats.org/drawingml/2006/main" noChangeAspect="1"/>
+                  </wp:cNvGraphicFramePr>
+                  <a:graphic xmlns:a="http://schemas.openxmlformats.org/drawingml/2006/main">
+                    <a:graphicData uri="http://schemas.openxmlformats.org/drawingml/2006/picture">
+                      <pic:pic xmlns:pic="http://schemas.openxmlformats.org/drawingml/2006/picture">
+                        <pic:nvPicPr>
+                          <pic:cNvPr id="1" name=""/>
+                          <pic:cNvPicPr/>
+                        </pic:nvPicPr>
+                        <pic:blipFill>
+                          <a:blip r:embed="rId20"/>
+                          <a:stretch>
+                            <a:fillRect/>
+                          </a:stretch>
+                        </pic:blipFill>
+                        <pic:spPr>
+                          <a:xfrm>
+                            <a:off x="0" y="0"/>
+                            <a:ext cx="3072606" cy="2005815"/>
+                          </a:xfrm>
+                          <a:prstGeom prst="rect">
+                            <a:avLst/>
+                          </a:prstGeom>
+                        </pic:spPr>
+                      </pic:pic>
+                    </a:graphicData>
+                  </a:graphic>
+                </wp:inline>
+              </w:drawing>
+            </w:r>
+          </w:p>
+        </w:tc>
+        <w:tc>
+          <w:tcPr>
+            <w:tcW w:w="4673" w:type="dxa"/>
+          </w:tcPr>
+          <w:p>
+            <w:pPr>
+              <w:pStyle w:val="NormalWeb"/>
+            </w:pPr>
+            <w:r>
+              <w:drawing>
+                <wp:inline distT="0" distB="0" distL="0" distR="0" wp14:anchorId="3D988A0D" wp14:editId="2B7D53A7">
+                  <wp:extent cx="3062287" cy="1984022"/>
+                  <wp:effectExtent l="0" t="0" r="5080" b="0"/>
+                  <wp:docPr id="5" name="Picture 5"/>
+                  <wp:cNvGraphicFramePr>
+                    <a:graphicFrameLocks xmlns:a="http://schemas.openxmlformats.org/drawingml/2006/main" noChangeAspect="1"/>
+                  </wp:cNvGraphicFramePr>
+                  <a:graphic xmlns:a="http://schemas.openxmlformats.org/drawingml/2006/main">
+                    <a:graphicData uri="http://schemas.openxmlformats.org/drawingml/2006/picture">
+                      <pic:pic xmlns:pic="http://schemas.openxmlformats.org/drawingml/2006/picture">
+                        <pic:nvPicPr>
+                          <pic:cNvPr id="1" name=""/>
+                          <pic:cNvPicPr/>
+                        </pic:nvPicPr>
+                        <pic:blipFill>
+                          <a:blip r:embed="rId21"/>
+                          <a:stretch>
+                            <a:fillRect/>
+                          </a:stretch>
+                        </pic:blipFill>
+                        <pic:spPr>
+                          <a:xfrm>
+                            <a:off x="0" y="0"/>
+                            <a:ext cx="3114513" cy="2017859"/>
+                          </a:xfrm>
+                          <a:prstGeom prst="rect">
+                            <a:avLst/>
+                          </a:prstGeom>
+                        </pic:spPr>
+                      </pic:pic>
+                    </a:graphicData>
+                  </a:graphic>
+                </wp:inline>
+              </w:drawing>
+            </w:r>
+          </w:p>
+        </w:tc>
+      </w:tr>
+    </w:tbl>
     <w:p>
       <w:pPr>
         <w:pStyle w:val="NormalWeb"/>
       </w:pPr>
-      <w:r>
-        <w:rPr>
-          <w:rStyle w:val="Strong"/>
-          <w:rFonts w:eastAsiaTheme="majorEastAsia"/>
-        </w:rPr>
-        <w:t>[Chèn Hình 3.7: Giao diện giỏ hàng trước khi thanh toán]</w:t>
-      </w:r>
-      <w:r>
-        <w:br/>
-      </w:r>
-      <w:r>
-        <w:rPr>
-          <w:rStyle w:val="Strong"/>
-          <w:rFonts w:eastAsiaTheme="majorEastAsia"/>
-        </w:rPr>
-        <w:t>[Chèn Hình 3.8: Nội dung hóa đơn sau khi thanh toán]</w:t>
-      </w:r>
+      <w:bookmarkStart w:id="18" w:name="_GoBack"/>
+      <w:bookmarkEnd w:id="18"/>
     </w:p>
     <w:p>
       <w:pPr>
         <w:pStyle w:val="Heading4"/>
       </w:pPr>
       <w:r>
+        <w:lastRenderedPageBreak/>
         <w:t>3.6.3. Nhập hàng</w:t>
       </w:r>
     </w:p>
@@ -9375,11 +9482,11 @@
           <w:rFonts w:cs="Times New Roman"/>
           <w:b/>
           <w:bCs/>
+          <w:noProof/>
           <w:sz w:val="24"/>
           <w:szCs w:val="24"/>
           <w:lang w:val="vi-VN"/>
         </w:rPr>
-        <w:lastRenderedPageBreak/>
         <w:drawing>
           <wp:inline distT="0" distB="0" distL="0" distR="0" wp14:anchorId="5248A4F9" wp14:editId="1BBA24A0">
             <wp:extent cx="4980215" cy="3221302"/>
@@ -9396,7 +9503,7 @@
                     <pic:cNvPicPr/>
                   </pic:nvPicPr>
                   <pic:blipFill>
-                    <a:blip r:embed="rId20"/>
+                    <a:blip r:embed="rId22"/>
                     <a:stretch>
                       <a:fillRect/>
                     </a:stretch>
@@ -9499,6 +9606,9 @@
               <w:pStyle w:val="NormalWeb"/>
             </w:pPr>
             <w:r>
+              <w:rPr>
+                <w:noProof/>
+              </w:rPr>
               <w:drawing>
                 <wp:inline distT="0" distB="0" distL="0" distR="0" wp14:anchorId="18775C7D" wp14:editId="0A5AE75B">
                   <wp:extent cx="2852057" cy="1904751"/>
@@ -9515,7 +9625,7 @@
                           <pic:cNvPicPr/>
                         </pic:nvPicPr>
                         <pic:blipFill>
-                          <a:blip r:embed="rId21"/>
+                          <a:blip r:embed="rId23"/>
                           <a:stretch>
                             <a:fillRect/>
                           </a:stretch>
@@ -9546,6 +9656,9 @@
               <w:pStyle w:val="NormalWeb"/>
             </w:pPr>
             <w:r>
+              <w:rPr>
+                <w:noProof/>
+              </w:rPr>
               <w:drawing>
                 <wp:inline distT="0" distB="0" distL="0" distR="0" wp14:anchorId="4E7B1553" wp14:editId="5506533B">
                   <wp:extent cx="2803072" cy="1861104"/>
@@ -9562,7 +9675,7 @@
                           <pic:cNvPicPr/>
                         </pic:nvPicPr>
                         <pic:blipFill>
-                          <a:blip r:embed="rId22"/>
+                          <a:blip r:embed="rId24"/>
                           <a:stretch>
                             <a:fillRect/>
                           </a:stretch>
@@ -9612,6 +9725,7 @@
         <w:pStyle w:val="NormalWeb"/>
       </w:pPr>
       <w:r>
+        <w:lastRenderedPageBreak/>
         <w:t>Chức năng nhà cung cấp hỗ trợ thêm, sửa, xóa, tìm kiếm và xem lịch sử đặt hàng của từng nhà cung cấp.</w:t>
       </w:r>
     </w:p>
@@ -9656,163 +9770,14 @@
               <w:pStyle w:val="NormalWeb"/>
             </w:pPr>
             <w:r>
-              <w:lastRenderedPageBreak/>
+              <w:rPr>
+                <w:noProof/>
+              </w:rPr>
               <w:drawing>
                 <wp:inline distT="0" distB="0" distL="0" distR="0" wp14:anchorId="03C2D591" wp14:editId="454014B2">
                   <wp:extent cx="3292475" cy="2177143"/>
                   <wp:effectExtent l="0" t="0" r="3175" b="0"/>
                   <wp:docPr id="14" name="Picture 14"/>
-                  <wp:cNvGraphicFramePr>
-                    <a:graphicFrameLocks xmlns:a="http://schemas.openxmlformats.org/drawingml/2006/main" noChangeAspect="1"/>
-                  </wp:cNvGraphicFramePr>
-                  <a:graphic xmlns:a="http://schemas.openxmlformats.org/drawingml/2006/main">
-                    <a:graphicData uri="http://schemas.openxmlformats.org/drawingml/2006/picture">
-                      <pic:pic xmlns:pic="http://schemas.openxmlformats.org/drawingml/2006/picture">
-                        <pic:nvPicPr>
-                          <pic:cNvPr id="1" name=""/>
-                          <pic:cNvPicPr/>
-                        </pic:nvPicPr>
-                        <pic:blipFill>
-                          <a:blip r:embed="rId23"/>
-                          <a:stretch>
-                            <a:fillRect/>
-                          </a:stretch>
-                        </pic:blipFill>
-                        <pic:spPr>
-                          <a:xfrm>
-                            <a:off x="0" y="0"/>
-                            <a:ext cx="3330124" cy="2202038"/>
-                          </a:xfrm>
-                          <a:prstGeom prst="rect">
-                            <a:avLst/>
-                          </a:prstGeom>
-                        </pic:spPr>
-                      </pic:pic>
-                    </a:graphicData>
-                  </a:graphic>
-                </wp:inline>
-              </w:drawing>
-            </w:r>
-          </w:p>
-        </w:tc>
-        <w:tc>
-          <w:tcPr>
-            <w:tcW w:w="4673" w:type="dxa"/>
-            <w:tcBorders>
-              <w:top w:val="nil"/>
-              <w:left w:val="nil"/>
-              <w:bottom w:val="nil"/>
-              <w:right w:val="nil"/>
-            </w:tcBorders>
-          </w:tcPr>
-          <w:p>
-            <w:pPr>
-              <w:pStyle w:val="NormalWeb"/>
-            </w:pPr>
-            <w:r>
-              <w:drawing>
-                <wp:inline distT="0" distB="0" distL="0" distR="0" wp14:anchorId="6B779C28" wp14:editId="379A5FF9">
-                  <wp:extent cx="3345677" cy="2155825"/>
-                  <wp:effectExtent l="0" t="0" r="7620" b="0"/>
-                  <wp:docPr id="15" name="Picture 15"/>
-                  <wp:cNvGraphicFramePr>
-                    <a:graphicFrameLocks xmlns:a="http://schemas.openxmlformats.org/drawingml/2006/main" noChangeAspect="1"/>
-                  </wp:cNvGraphicFramePr>
-                  <a:graphic xmlns:a="http://schemas.openxmlformats.org/drawingml/2006/main">
-                    <a:graphicData uri="http://schemas.openxmlformats.org/drawingml/2006/picture">
-                      <pic:pic xmlns:pic="http://schemas.openxmlformats.org/drawingml/2006/picture">
-                        <pic:nvPicPr>
-                          <pic:cNvPr id="1" name=""/>
-                          <pic:cNvPicPr/>
-                        </pic:nvPicPr>
-                        <pic:blipFill>
-                          <a:blip r:embed="rId24"/>
-                          <a:stretch>
-                            <a:fillRect/>
-                          </a:stretch>
-                        </pic:blipFill>
-                        <pic:spPr>
-                          <a:xfrm>
-                            <a:off x="0" y="0"/>
-                            <a:ext cx="3408929" cy="2196582"/>
-                          </a:xfrm>
-                          <a:prstGeom prst="rect">
-                            <a:avLst/>
-                          </a:prstGeom>
-                        </pic:spPr>
-                      </pic:pic>
-                    </a:graphicData>
-                  </a:graphic>
-                </wp:inline>
-              </w:drawing>
-            </w:r>
-          </w:p>
-        </w:tc>
-      </w:tr>
-    </w:tbl>
-    <w:p>
-      <w:pPr>
-        <w:pStyle w:val="NormalWeb"/>
-      </w:pPr>
-    </w:p>
-    <w:p>
-      <w:pPr>
-        <w:pStyle w:val="NormalWeb"/>
-      </w:pPr>
-      <w:r>
-        <w:br/>
-      </w:r>
-    </w:p>
-    <w:p>
-      <w:pPr>
-        <w:pStyle w:val="Heading4"/>
-      </w:pPr>
-      <w:r>
-        <w:t>3.6.6. Dashboard và báo cáo</w:t>
-      </w:r>
-    </w:p>
-    <w:p>
-      <w:pPr>
-        <w:pStyle w:val="NormalWeb"/>
-      </w:pPr>
-      <w:r>
-        <w:t>Dashboard hiển thị số hóa đơn, doanh thu, số sản phẩm đang bán, tổng tồn kho và danh sách hàng sắp hết.</w:t>
-      </w:r>
-    </w:p>
-    <w:p>
-      <w:pPr>
-        <w:pStyle w:val="NormalWeb"/>
-      </w:pPr>
-      <w:r>
-        <w:t>Chức năng báo cáo cho phép chọn khoảng thời gian để thống kê doanh thu, tổng tiền nhập hàng, lợi nhuận tạm tính, sản phẩm bán chạy và sản phẩm có tồn kho thấp.</w:t>
-      </w:r>
-    </w:p>
-    <w:tbl>
-      <w:tblPr>
-        <w:tblStyle w:val="TableGrid"/>
-        <w:tblW w:w="0" w:type="auto"/>
-        <w:tblLook w:val="04A0" w:firstRow="1" w:lastRow="0" w:firstColumn="1" w:lastColumn="0" w:noHBand="0" w:noVBand="1"/>
-      </w:tblPr>
-      <w:tblGrid>
-        <w:gridCol w:w="4662"/>
-        <w:gridCol w:w="4683"/>
-      </w:tblGrid>
-      <w:tr>
-        <w:tc>
-          <w:tcPr>
-            <w:tcW w:w="4672" w:type="dxa"/>
-          </w:tcPr>
-          <w:p>
-            <w:pPr>
-              <w:pStyle w:val="Heading2"/>
-              <w:outlineLvl w:val="1"/>
-            </w:pPr>
-            <w:r>
-              <w:drawing>
-                <wp:inline distT="0" distB="0" distL="0" distR="0" wp14:anchorId="01933334" wp14:editId="3E95D1E3">
-                  <wp:extent cx="2824843" cy="1915160"/>
-                  <wp:effectExtent l="0" t="0" r="0" b="8890"/>
-                  <wp:docPr id="16" name="Picture 16"/>
                   <wp:cNvGraphicFramePr>
                     <a:graphicFrameLocks xmlns:a="http://schemas.openxmlformats.org/drawingml/2006/main" noChangeAspect="1"/>
                   </wp:cNvGraphicFramePr>
@@ -9832,7 +9797,7 @@
                         <pic:spPr>
                           <a:xfrm>
                             <a:off x="0" y="0"/>
-                            <a:ext cx="2865757" cy="1942899"/>
+                            <a:ext cx="3330124" cy="2202038"/>
                           </a:xfrm>
                           <a:prstGeom prst="rect">
                             <a:avLst/>
@@ -9849,18 +9814,26 @@
         <w:tc>
           <w:tcPr>
             <w:tcW w:w="4673" w:type="dxa"/>
+            <w:tcBorders>
+              <w:top w:val="nil"/>
+              <w:left w:val="nil"/>
+              <w:bottom w:val="nil"/>
+              <w:right w:val="nil"/>
+            </w:tcBorders>
           </w:tcPr>
           <w:p>
             <w:pPr>
-              <w:pStyle w:val="Heading2"/>
-              <w:outlineLvl w:val="1"/>
+              <w:pStyle w:val="NormalWeb"/>
             </w:pPr>
             <w:r>
+              <w:rPr>
+                <w:noProof/>
+              </w:rPr>
               <w:drawing>
-                <wp:inline distT="0" distB="0" distL="0" distR="0" wp14:anchorId="1DD1B4E0" wp14:editId="6ACAF2E8">
-                  <wp:extent cx="2831772" cy="1898650"/>
-                  <wp:effectExtent l="0" t="0" r="6985" b="6350"/>
-                  <wp:docPr id="17" name="Picture 17"/>
+                <wp:inline distT="0" distB="0" distL="0" distR="0" wp14:anchorId="6B779C28" wp14:editId="379A5FF9">
+                  <wp:extent cx="3345677" cy="2155825"/>
+                  <wp:effectExtent l="0" t="0" r="7620" b="0"/>
+                  <wp:docPr id="15" name="Picture 15"/>
                   <wp:cNvGraphicFramePr>
                     <a:graphicFrameLocks xmlns:a="http://schemas.openxmlformats.org/drawingml/2006/main" noChangeAspect="1"/>
                   </wp:cNvGraphicFramePr>
@@ -9880,6 +9853,159 @@
                         <pic:spPr>
                           <a:xfrm>
                             <a:off x="0" y="0"/>
+                            <a:ext cx="3408929" cy="2196582"/>
+                          </a:xfrm>
+                          <a:prstGeom prst="rect">
+                            <a:avLst/>
+                          </a:prstGeom>
+                        </pic:spPr>
+                      </pic:pic>
+                    </a:graphicData>
+                  </a:graphic>
+                </wp:inline>
+              </w:drawing>
+            </w:r>
+          </w:p>
+        </w:tc>
+      </w:tr>
+    </w:tbl>
+    <w:p>
+      <w:pPr>
+        <w:pStyle w:val="NormalWeb"/>
+      </w:pPr>
+    </w:p>
+    <w:p>
+      <w:pPr>
+        <w:pStyle w:val="NormalWeb"/>
+      </w:pPr>
+      <w:r>
+        <w:br/>
+      </w:r>
+    </w:p>
+    <w:p>
+      <w:pPr>
+        <w:pStyle w:val="Heading4"/>
+      </w:pPr>
+      <w:r>
+        <w:t>3.6.6. Dashboard và báo cáo</w:t>
+      </w:r>
+    </w:p>
+    <w:p>
+      <w:pPr>
+        <w:pStyle w:val="NormalWeb"/>
+      </w:pPr>
+      <w:r>
+        <w:t>Dashboard hiển thị số hóa đơn, doanh thu, số sản phẩm đang bán, tổng tồn kho và danh sách hàng sắp hết.</w:t>
+      </w:r>
+    </w:p>
+    <w:p>
+      <w:pPr>
+        <w:pStyle w:val="NormalWeb"/>
+      </w:pPr>
+      <w:r>
+        <w:t>Chức năng báo cáo cho phép chọn khoảng thời gian để thống kê doanh thu, tổng tiền nhập hàng, lợi nhuận tạm tính, sản phẩm bán chạy và sản phẩm có tồn kho thấp.</w:t>
+      </w:r>
+    </w:p>
+    <w:tbl>
+      <w:tblPr>
+        <w:tblStyle w:val="TableGrid"/>
+        <w:tblW w:w="0" w:type="auto"/>
+        <w:tblLook w:val="04A0" w:firstRow="1" w:lastRow="0" w:firstColumn="1" w:lastColumn="0" w:noHBand="0" w:noVBand="1"/>
+      </w:tblPr>
+      <w:tblGrid>
+        <w:gridCol w:w="4662"/>
+        <w:gridCol w:w="4683"/>
+      </w:tblGrid>
+      <w:tr>
+        <w:tc>
+          <w:tcPr>
+            <w:tcW w:w="4672" w:type="dxa"/>
+          </w:tcPr>
+          <w:p>
+            <w:pPr>
+              <w:pStyle w:val="Heading2"/>
+              <w:outlineLvl w:val="1"/>
+            </w:pPr>
+            <w:r>
+              <w:rPr>
+                <w:noProof/>
+              </w:rPr>
+              <w:lastRenderedPageBreak/>
+              <w:drawing>
+                <wp:inline distT="0" distB="0" distL="0" distR="0" wp14:anchorId="01933334" wp14:editId="3E95D1E3">
+                  <wp:extent cx="2824843" cy="1915160"/>
+                  <wp:effectExtent l="0" t="0" r="0" b="8890"/>
+                  <wp:docPr id="16" name="Picture 16"/>
+                  <wp:cNvGraphicFramePr>
+                    <a:graphicFrameLocks xmlns:a="http://schemas.openxmlformats.org/drawingml/2006/main" noChangeAspect="1"/>
+                  </wp:cNvGraphicFramePr>
+                  <a:graphic xmlns:a="http://schemas.openxmlformats.org/drawingml/2006/main">
+                    <a:graphicData uri="http://schemas.openxmlformats.org/drawingml/2006/picture">
+                      <pic:pic xmlns:pic="http://schemas.openxmlformats.org/drawingml/2006/picture">
+                        <pic:nvPicPr>
+                          <pic:cNvPr id="1" name=""/>
+                          <pic:cNvPicPr/>
+                        </pic:nvPicPr>
+                        <pic:blipFill>
+                          <a:blip r:embed="rId27"/>
+                          <a:stretch>
+                            <a:fillRect/>
+                          </a:stretch>
+                        </pic:blipFill>
+                        <pic:spPr>
+                          <a:xfrm>
+                            <a:off x="0" y="0"/>
+                            <a:ext cx="2865757" cy="1942899"/>
+                          </a:xfrm>
+                          <a:prstGeom prst="rect">
+                            <a:avLst/>
+                          </a:prstGeom>
+                        </pic:spPr>
+                      </pic:pic>
+                    </a:graphicData>
+                  </a:graphic>
+                </wp:inline>
+              </w:drawing>
+            </w:r>
+          </w:p>
+        </w:tc>
+        <w:tc>
+          <w:tcPr>
+            <w:tcW w:w="4673" w:type="dxa"/>
+          </w:tcPr>
+          <w:p>
+            <w:pPr>
+              <w:pStyle w:val="Heading2"/>
+              <w:outlineLvl w:val="1"/>
+            </w:pPr>
+            <w:r>
+              <w:rPr>
+                <w:noProof/>
+              </w:rPr>
+              <w:drawing>
+                <wp:inline distT="0" distB="0" distL="0" distR="0" wp14:anchorId="1DD1B4E0" wp14:editId="6ACAF2E8">
+                  <wp:extent cx="2831772" cy="1898650"/>
+                  <wp:effectExtent l="0" t="0" r="6985" b="6350"/>
+                  <wp:docPr id="17" name="Picture 17"/>
+                  <wp:cNvGraphicFramePr>
+                    <a:graphicFrameLocks xmlns:a="http://schemas.openxmlformats.org/drawingml/2006/main" noChangeAspect="1"/>
+                  </wp:cNvGraphicFramePr>
+                  <a:graphic xmlns:a="http://schemas.openxmlformats.org/drawingml/2006/main">
+                    <a:graphicData uri="http://schemas.openxmlformats.org/drawingml/2006/picture">
+                      <pic:pic xmlns:pic="http://schemas.openxmlformats.org/drawingml/2006/picture">
+                        <pic:nvPicPr>
+                          <pic:cNvPr id="1" name=""/>
+                          <pic:cNvPicPr/>
+                        </pic:nvPicPr>
+                        <pic:blipFill>
+                          <a:blip r:embed="rId28"/>
+                          <a:stretch>
+                            <a:fillRect/>
+                          </a:stretch>
+                        </pic:blipFill>
+                        <pic:spPr>
+                          <a:xfrm>
+                            <a:off x="0" y="0"/>
                             <a:ext cx="2959343" cy="1984184"/>
                           </a:xfrm>
                           <a:prstGeom prst="rect">
@@ -9933,7 +10059,6 @@
         <w:pStyle w:val="Heading3"/>
       </w:pPr>
       <w:r>
-        <w:lastRenderedPageBreak/>
         <w:t>4.2. Bộ dữ liệu thử nghiệm</w:t>
       </w:r>
     </w:p>
@@ -10728,6 +10853,7 @@
           </w:tcPr>
           <w:p>
             <w:r>
+              <w:lastRenderedPageBreak/>
               <w:t>TC10</w:t>
             </w:r>
           </w:p>
@@ -10924,8 +11050,8 @@
         <w:rPr>
           <w:rStyle w:val="Strong"/>
           <w:rFonts w:eastAsiaTheme="majorEastAsia"/>
-        </w:rPr>
-        <w:lastRenderedPageBreak/>
+          <w:noProof/>
+        </w:rPr>
         <w:drawing>
           <wp:inline distT="0" distB="0" distL="0" distR="0" wp14:anchorId="1D4ACD4A" wp14:editId="3D1CC98D">
             <wp:extent cx="3619500" cy="2740451"/>
@@ -10942,7 +11068,7 @@
                     <pic:cNvPicPr/>
                   </pic:nvPicPr>
                   <pic:blipFill>
-                    <a:blip r:embed="rId27"/>
+                    <a:blip r:embed="rId29"/>
                     <a:stretch>
                       <a:fillRect/>
                     </a:stretch>
@@ -10999,6 +11125,9 @@
               </w:rPr>
             </w:pPr>
             <w:r>
+              <w:rPr>
+                <w:noProof/>
+              </w:rPr>
               <w:drawing>
                 <wp:inline distT="0" distB="0" distL="0" distR="0" wp14:anchorId="54D36A1E" wp14:editId="2C19CC79">
                   <wp:extent cx="2975395" cy="1926771"/>
@@ -11015,7 +11144,7 @@
                           <pic:cNvPicPr/>
                         </pic:nvPicPr>
                         <pic:blipFill>
-                          <a:blip r:embed="rId28"/>
+                          <a:blip r:embed="rId30"/>
                           <a:stretch>
                             <a:fillRect/>
                           </a:stretch>
@@ -11054,6 +11183,7 @@
               <w:rPr>
                 <w:rStyle w:val="Strong"/>
                 <w:rFonts w:eastAsiaTheme="majorEastAsia"/>
+                <w:noProof/>
                 <w:lang w:val="en-US"/>
               </w:rPr>
               <w:drawing>
@@ -11072,7 +11202,7 @@
                           <pic:cNvPicPr/>
                         </pic:nvPicPr>
                         <pic:blipFill>
-                          <a:blip r:embed="rId29"/>
+                          <a:blip r:embed="rId31"/>
                           <a:stretch>
                             <a:fillRect/>
                           </a:stretch>
@@ -11124,6 +11254,10 @@
         </w:rPr>
       </w:pPr>
       <w:r>
+        <w:rPr>
+          <w:noProof/>
+        </w:rPr>
+        <w:lastRenderedPageBreak/>
         <w:drawing>
           <wp:inline distT="0" distB="0" distL="0" distR="0" wp14:anchorId="60157BEE" wp14:editId="4D3C3126">
             <wp:extent cx="4798196" cy="3113314"/>
@@ -11140,7 +11274,7 @@
                     <pic:cNvPicPr/>
                   </pic:nvPicPr>
                   <pic:blipFill>
-                    <a:blip r:embed="rId30"/>
+                    <a:blip r:embed="rId32"/>
                     <a:stretch>
                       <a:fillRect/>
                     </a:stretch>
@@ -11180,7 +11314,6 @@
         <w:pStyle w:val="Heading2"/>
       </w:pPr>
       <w:r>
-        <w:lastRenderedPageBreak/>
         <w:t>V. KẾT LUẬN</w:t>
       </w:r>
     </w:p>
@@ -11224,7 +11357,7 @@
         </w:numPr>
         <w:spacing w:before="100" w:beforeAutospacing="1" w:after="100" w:afterAutospacing="1"/>
       </w:pPr>
-      <w:hyperlink r:id="rId31" w:history="1">
+      <w:hyperlink r:id="rId33" w:history="1">
         <w:r>
           <w:rPr>
             <w:rStyle w:val="Hyperlink"/>
@@ -11245,7 +11378,7 @@
         </w:numPr>
         <w:spacing w:before="100" w:beforeAutospacing="1" w:after="100" w:afterAutospacing="1"/>
       </w:pPr>
-      <w:hyperlink r:id="rId32" w:history="1">
+      <w:hyperlink r:id="rId34" w:history="1">
         <w:r>
           <w:rPr>
             <w:rStyle w:val="Hyperlink"/>
@@ -11266,7 +11399,7 @@
         </w:numPr>
         <w:spacing w:before="100" w:beforeAutospacing="1" w:after="100" w:afterAutospacing="1"/>
       </w:pPr>
-      <w:hyperlink r:id="rId33" w:history="1">
+      <w:hyperlink r:id="rId35" w:history="1">
         <w:r>
           <w:rPr>
             <w:rStyle w:val="Hyperlink"/>
@@ -11287,7 +11420,7 @@
         </w:numPr>
         <w:spacing w:before="100" w:beforeAutospacing="1" w:after="100" w:afterAutospacing="1"/>
       </w:pPr>
-      <w:hyperlink r:id="rId34" w:history="1">
+      <w:hyperlink r:id="rId36" w:history="1">
         <w:r>
           <w:rPr>
             <w:rStyle w:val="Hyperlink"/>
@@ -11308,7 +11441,7 @@
         </w:numPr>
         <w:spacing w:before="100" w:beforeAutospacing="1" w:after="100" w:afterAutospacing="1"/>
       </w:pPr>
-      <w:hyperlink r:id="rId35" w:history="1">
+      <w:hyperlink r:id="rId37" w:history="1">
         <w:r>
           <w:rPr>
             <w:rStyle w:val="Hyperlink"/>
@@ -11332,8 +11465,6 @@
           <w:lang w:val="en-US"/>
         </w:rPr>
       </w:pPr>
-      <w:bookmarkStart w:id="18" w:name="_GoBack"/>
-      <w:bookmarkEnd w:id="18"/>
     </w:p>
     <w:p>
       <w:pPr>
@@ -11350,9 +11481,9 @@
       </w:pPr>
     </w:p>
     <w:sectPr>
-      <w:headerReference w:type="default" r:id="rId36"/>
-      <w:headerReference w:type="first" r:id="rId37"/>
-      <w:footerReference w:type="first" r:id="rId38"/>
+      <w:headerReference w:type="default" r:id="rId38"/>
+      <w:headerReference w:type="first" r:id="rId39"/>
+      <w:footerReference w:type="first" r:id="rId40"/>
       <w:pgSz w:w="11907" w:h="16840" w:code="9"/>
       <w:pgMar w:top="1134" w:right="1134" w:bottom="1134" w:left="1418" w:header="720" w:footer="720" w:gutter="0"/>
       <w:pgNumType w:start="3" w:chapStyle="1"/>
@@ -16331,7 +16462,7 @@
 </file>
 
 <file path=customXml/itemProps1.xml><?xml version="1.0" encoding="utf-8"?>
-<ds:datastoreItem xmlns:ds="http://schemas.openxmlformats.org/officeDocument/2006/customXml" ds:itemID="{097B3FFD-E711-4517-8033-0EC7206437B8}">
+<ds:datastoreItem xmlns:ds="http://schemas.openxmlformats.org/officeDocument/2006/customXml" ds:itemID="{2F45FF68-2C97-4D0C-8806-C6DA983D2F7D}">
   <ds:schemaRefs>
     <ds:schemaRef ds:uri="http://schemas.openxmlformats.org/officeDocument/2006/bibliography"/>
   </ds:schemaRefs>

</xml_diff>